<commit_message>
Update FB 2.9.4.1 (April 1 2016).docx
</commit_message>
<xml_diff>
--- a/FB 2.9.4.1 (April 1 2016).docx
+++ b/FB 2.9.4.1 (April 1 2016).docx
@@ -30,7 +30,12 @@
             <w:pStyle w:val="TOCHeading"/>
           </w:pPr>
           <w:r>
-            <w:t>Contents</w:t>
+            <w:t>Cont</w:t>
+          </w:r>
+          <w:bookmarkStart w:id="1" w:name="_GoBack"/>
+          <w:bookmarkEnd w:id="1"/>
+          <w:r>
+            <w:t>ents</w:t>
           </w:r>
         </w:p>
         <w:p>
@@ -53,7 +58,7 @@
           <w:r>
             <w:fldChar w:fldCharType="separate"/>
           </w:r>
-          <w:hyperlink w:anchor="_Toc40883745" w:history="1">
+          <w:hyperlink w:anchor="_Toc40886092" w:history="1">
             <w:r>
               <w:rPr>
                 <w:rStyle w:val="Hyperlink"/>
@@ -80,7 +85,7 @@
                 <w:noProof/>
                 <w:webHidden/>
               </w:rPr>
-              <w:instrText xml:space="preserve"> PAGEREF _Toc40883745 \h </w:instrText>
+              <w:instrText xml:space="preserve"> PAGEREF _Toc40886092 \h </w:instrText>
             </w:r>
             <w:r>
               <w:rPr>
@@ -122,7 +127,7 @@
               <w:lang w:eastAsia="en-US"/>
             </w:rPr>
           </w:pPr>
-          <w:hyperlink w:anchor="_Toc40883746" w:history="1">
+          <w:hyperlink w:anchor="_Toc40886093" w:history="1">
             <w:r>
               <w:rPr>
                 <w:rStyle w:val="Hyperlink"/>
@@ -149,7 +154,7 @@
                 <w:noProof/>
                 <w:webHidden/>
               </w:rPr>
-              <w:instrText xml:space="preserve"> PAGEREF _Toc40883746 \h </w:instrText>
+              <w:instrText xml:space="preserve"> PAGEREF _Toc40886093 \h </w:instrText>
             </w:r>
             <w:r>
               <w:rPr>
@@ -191,7 +196,7 @@
               <w:lang w:eastAsia="en-US"/>
             </w:rPr>
           </w:pPr>
-          <w:hyperlink w:anchor="_Toc40883747" w:history="1">
+          <w:hyperlink w:anchor="_Toc40886094" w:history="1">
             <w:r>
               <w:rPr>
                 <w:rStyle w:val="Hyperlink"/>
@@ -218,7 +223,7 @@
                 <w:noProof/>
                 <w:webHidden/>
               </w:rPr>
-              <w:instrText xml:space="preserve"> PAGEREF _Toc40883747 \h </w:instrText>
+              <w:instrText xml:space="preserve"> PAGEREF _Toc40886094 \h </w:instrText>
             </w:r>
             <w:r>
               <w:rPr>
@@ -260,7 +265,7 @@
               <w:lang w:eastAsia="en-US"/>
             </w:rPr>
           </w:pPr>
-          <w:hyperlink w:anchor="_Toc40883748" w:history="1">
+          <w:hyperlink w:anchor="_Toc40886095" w:history="1">
             <w:r>
               <w:rPr>
                 <w:rStyle w:val="Hyperlink"/>
@@ -287,7 +292,7 @@
                 <w:noProof/>
                 <w:webHidden/>
               </w:rPr>
-              <w:instrText xml:space="preserve"> PAGEREF _Toc40883748 \h </w:instrText>
+              <w:instrText xml:space="preserve"> PAGEREF _Toc40886095 \h </w:instrText>
             </w:r>
             <w:r>
               <w:rPr>
@@ -329,7 +334,7 @@
               <w:lang w:eastAsia="en-US"/>
             </w:rPr>
           </w:pPr>
-          <w:hyperlink w:anchor="_Toc40883749" w:history="1">
+          <w:hyperlink w:anchor="_Toc40886096" w:history="1">
             <w:r>
               <w:rPr>
                 <w:rStyle w:val="Hyperlink"/>
@@ -356,7 +361,7 @@
                 <w:noProof/>
                 <w:webHidden/>
               </w:rPr>
-              <w:instrText xml:space="preserve"> PAGEREF _Toc40883749 \h </w:instrText>
+              <w:instrText xml:space="preserve"> PAGEREF _Toc40886096 \h </w:instrText>
             </w:r>
             <w:r>
               <w:rPr>
@@ -398,7 +403,7 @@
               <w:lang w:eastAsia="en-US"/>
             </w:rPr>
           </w:pPr>
-          <w:hyperlink w:anchor="_Toc40883750" w:history="1">
+          <w:hyperlink w:anchor="_Toc40886097" w:history="1">
             <w:r>
               <w:rPr>
                 <w:rStyle w:val="Hyperlink"/>
@@ -425,7 +430,7 @@
                 <w:noProof/>
                 <w:webHidden/>
               </w:rPr>
-              <w:instrText xml:space="preserve"> PAGEREF _Toc40883750 \h </w:instrText>
+              <w:instrText xml:space="preserve"> PAGEREF _Toc40886097 \h </w:instrText>
             </w:r>
             <w:r>
               <w:rPr>
@@ -467,7 +472,7 @@
               <w:lang w:eastAsia="en-US"/>
             </w:rPr>
           </w:pPr>
-          <w:hyperlink w:anchor="_Toc40883751" w:history="1">
+          <w:hyperlink w:anchor="_Toc40886098" w:history="1">
             <w:r>
               <w:rPr>
                 <w:rStyle w:val="Hyperlink"/>
@@ -494,7 +499,7 @@
                 <w:noProof/>
                 <w:webHidden/>
               </w:rPr>
-              <w:instrText xml:space="preserve"> PAGEREF _Toc40883751 \h </w:instrText>
+              <w:instrText xml:space="preserve"> PAGEREF _Toc40886098 \h </w:instrText>
             </w:r>
             <w:r>
               <w:rPr>
@@ -514,7 +519,7 @@
                 <w:noProof/>
                 <w:webHidden/>
               </w:rPr>
-              <w:t>5</w:t>
+              <w:t>4</w:t>
             </w:r>
             <w:r>
               <w:rPr>
@@ -536,13 +541,13 @@
               <w:lang w:eastAsia="en-US"/>
             </w:rPr>
           </w:pPr>
-          <w:hyperlink w:anchor="_Toc40883752" w:history="1">
+          <w:hyperlink w:anchor="_Toc40886099" w:history="1">
             <w:r>
               <w:rPr>
                 <w:rStyle w:val="Hyperlink"/>
                 <w:noProof/>
               </w:rPr>
-              <w:t>Health Care Assistant (HCA) Program</w:t>
+              <w:t>Data Witness</w:t>
             </w:r>
             <w:r>
               <w:rPr>
@@ -563,7 +568,76 @@
                 <w:noProof/>
                 <w:webHidden/>
               </w:rPr>
-              <w:instrText xml:space="preserve"> PAGEREF _Toc40883752 \h </w:instrText>
+              <w:instrText xml:space="preserve"> PAGEREF _Toc40886099 \h </w:instrText>
+            </w:r>
+            <w:r>
+              <w:rPr>
+                <w:noProof/>
+                <w:webHidden/>
+              </w:rPr>
+            </w:r>
+            <w:r>
+              <w:rPr>
+                <w:noProof/>
+                <w:webHidden/>
+              </w:rPr>
+              <w:fldChar w:fldCharType="separate"/>
+            </w:r>
+            <w:r>
+              <w:rPr>
+                <w:noProof/>
+                <w:webHidden/>
+              </w:rPr>
+              <w:t>6</w:t>
+            </w:r>
+            <w:r>
+              <w:rPr>
+                <w:noProof/>
+                <w:webHidden/>
+              </w:rPr>
+              <w:fldChar w:fldCharType="end"/>
+            </w:r>
+          </w:hyperlink>
+        </w:p>
+        <w:p>
+          <w:pPr>
+            <w:pStyle w:val="TOC1"/>
+            <w:tabs>
+              <w:tab w:val="right" w:leader="dot" w:pos="9350"/>
+            </w:tabs>
+            <w:rPr>
+              <w:noProof/>
+              <w:lang w:eastAsia="en-US"/>
+            </w:rPr>
+          </w:pPr>
+          <w:hyperlink w:anchor="_Toc40886100" w:history="1">
+            <w:r>
+              <w:rPr>
+                <w:rStyle w:val="Hyperlink"/>
+                <w:noProof/>
+              </w:rPr>
+              <w:t>Exam Invigilations</w:t>
+            </w:r>
+            <w:r>
+              <w:rPr>
+                <w:noProof/>
+                <w:webHidden/>
+              </w:rPr>
+              <w:tab/>
+            </w:r>
+            <w:r>
+              <w:rPr>
+                <w:noProof/>
+                <w:webHidden/>
+              </w:rPr>
+              <w:fldChar w:fldCharType="begin"/>
+            </w:r>
+            <w:r>
+              <w:rPr>
+                <w:noProof/>
+                <w:webHidden/>
+              </w:rPr>
+              <w:instrText xml:space="preserve"> PAGEREF _Toc40886100 \h </w:instrText>
             </w:r>
             <w:r>
               <w:rPr>
@@ -605,13 +679,13 @@
               <w:lang w:eastAsia="en-US"/>
             </w:rPr>
           </w:pPr>
-          <w:hyperlink w:anchor="_Toc40883753" w:history="1">
+          <w:hyperlink w:anchor="_Toc40886101" w:history="1">
             <w:r>
               <w:rPr>
                 <w:rStyle w:val="Hyperlink"/>
                 <w:noProof/>
               </w:rPr>
-              <w:t>Name Tags and Transfer Belts</w:t>
+              <w:t>Booking an Exam</w:t>
             </w:r>
             <w:r>
               <w:rPr>
@@ -632,7 +706,7 @@
                 <w:noProof/>
                 <w:webHidden/>
               </w:rPr>
-              <w:instrText xml:space="preserve"> PAGEREF _Toc40883753 \h </w:instrText>
+              <w:instrText xml:space="preserve"> PAGEREF _Toc40886101 \h </w:instrText>
             </w:r>
             <w:r>
               <w:rPr>
@@ -652,7 +726,7 @@
                 <w:noProof/>
                 <w:webHidden/>
               </w:rPr>
-              <w:t>6</w:t>
+              <w:t>7</w:t>
             </w:r>
             <w:r>
               <w:rPr>
@@ -674,13 +748,13 @@
               <w:lang w:eastAsia="en-US"/>
             </w:rPr>
           </w:pPr>
-          <w:hyperlink w:anchor="_Toc40883754" w:history="1">
+          <w:hyperlink w:anchor="_Toc40886102" w:history="1">
             <w:r>
               <w:rPr>
                 <w:rStyle w:val="Hyperlink"/>
                 <w:noProof/>
               </w:rPr>
-              <w:t>HCA Contracts</w:t>
+              <w:t>The Day of the Exam</w:t>
             </w:r>
             <w:r>
               <w:rPr>
@@ -701,7 +775,7 @@
                 <w:noProof/>
                 <w:webHidden/>
               </w:rPr>
-              <w:instrText xml:space="preserve"> PAGEREF _Toc40883754 \h </w:instrText>
+              <w:instrText xml:space="preserve"> PAGEREF _Toc40886102 \h </w:instrText>
             </w:r>
             <w:r>
               <w:rPr>
@@ -721,7 +795,352 @@
                 <w:noProof/>
                 <w:webHidden/>
               </w:rPr>
-              <w:t>6</w:t>
+              <w:t>7</w:t>
+            </w:r>
+            <w:r>
+              <w:rPr>
+                <w:noProof/>
+                <w:webHidden/>
+              </w:rPr>
+              <w:fldChar w:fldCharType="end"/>
+            </w:r>
+          </w:hyperlink>
+        </w:p>
+        <w:p>
+          <w:pPr>
+            <w:pStyle w:val="TOC1"/>
+            <w:tabs>
+              <w:tab w:val="right" w:leader="dot" w:pos="9350"/>
+            </w:tabs>
+            <w:rPr>
+              <w:noProof/>
+              <w:lang w:eastAsia="en-US"/>
+            </w:rPr>
+          </w:pPr>
+          <w:hyperlink w:anchor="_Toc40886103" w:history="1">
+            <w:r>
+              <w:rPr>
+                <w:rStyle w:val="Hyperlink"/>
+                <w:noProof/>
+              </w:rPr>
+              <w:t>Order of Documents in Student Folder (Active)</w:t>
+            </w:r>
+            <w:r>
+              <w:rPr>
+                <w:noProof/>
+                <w:webHidden/>
+              </w:rPr>
+              <w:tab/>
+            </w:r>
+            <w:r>
+              <w:rPr>
+                <w:noProof/>
+                <w:webHidden/>
+              </w:rPr>
+              <w:fldChar w:fldCharType="begin"/>
+            </w:r>
+            <w:r>
+              <w:rPr>
+                <w:noProof/>
+                <w:webHidden/>
+              </w:rPr>
+              <w:instrText xml:space="preserve"> PAGEREF _Toc40886103 \h </w:instrText>
+            </w:r>
+            <w:r>
+              <w:rPr>
+                <w:noProof/>
+                <w:webHidden/>
+              </w:rPr>
+            </w:r>
+            <w:r>
+              <w:rPr>
+                <w:noProof/>
+                <w:webHidden/>
+              </w:rPr>
+              <w:fldChar w:fldCharType="separate"/>
+            </w:r>
+            <w:r>
+              <w:rPr>
+                <w:noProof/>
+                <w:webHidden/>
+              </w:rPr>
+              <w:t>7</w:t>
+            </w:r>
+            <w:r>
+              <w:rPr>
+                <w:noProof/>
+                <w:webHidden/>
+              </w:rPr>
+              <w:fldChar w:fldCharType="end"/>
+            </w:r>
+          </w:hyperlink>
+        </w:p>
+        <w:p>
+          <w:pPr>
+            <w:pStyle w:val="TOC1"/>
+            <w:tabs>
+              <w:tab w:val="right" w:leader="dot" w:pos="9350"/>
+            </w:tabs>
+            <w:rPr>
+              <w:noProof/>
+              <w:lang w:eastAsia="en-US"/>
+            </w:rPr>
+          </w:pPr>
+          <w:hyperlink w:anchor="_Toc40886104" w:history="1">
+            <w:r>
+              <w:rPr>
+                <w:rStyle w:val="Hyperlink"/>
+                <w:noProof/>
+              </w:rPr>
+              <w:t>Order of Documents in Student Folder (Closed)</w:t>
+            </w:r>
+            <w:r>
+              <w:rPr>
+                <w:noProof/>
+                <w:webHidden/>
+              </w:rPr>
+              <w:tab/>
+            </w:r>
+            <w:r>
+              <w:rPr>
+                <w:noProof/>
+                <w:webHidden/>
+              </w:rPr>
+              <w:fldChar w:fldCharType="begin"/>
+            </w:r>
+            <w:r>
+              <w:rPr>
+                <w:noProof/>
+                <w:webHidden/>
+              </w:rPr>
+              <w:instrText xml:space="preserve"> PAGEREF _Toc40886104 \h </w:instrText>
+            </w:r>
+            <w:r>
+              <w:rPr>
+                <w:noProof/>
+                <w:webHidden/>
+              </w:rPr>
+            </w:r>
+            <w:r>
+              <w:rPr>
+                <w:noProof/>
+                <w:webHidden/>
+              </w:rPr>
+              <w:fldChar w:fldCharType="separate"/>
+            </w:r>
+            <w:r>
+              <w:rPr>
+                <w:noProof/>
+                <w:webHidden/>
+              </w:rPr>
+              <w:t>8</w:t>
+            </w:r>
+            <w:r>
+              <w:rPr>
+                <w:noProof/>
+                <w:webHidden/>
+              </w:rPr>
+              <w:fldChar w:fldCharType="end"/>
+            </w:r>
+          </w:hyperlink>
+        </w:p>
+        <w:p>
+          <w:pPr>
+            <w:pStyle w:val="TOC1"/>
+            <w:tabs>
+              <w:tab w:val="right" w:leader="dot" w:pos="9350"/>
+            </w:tabs>
+            <w:rPr>
+              <w:noProof/>
+              <w:lang w:eastAsia="en-US"/>
+            </w:rPr>
+          </w:pPr>
+          <w:hyperlink w:anchor="_Toc40886105" w:history="1">
+            <w:r>
+              <w:rPr>
+                <w:rStyle w:val="Hyperlink"/>
+                <w:noProof/>
+              </w:rPr>
+              <w:t>T2202A Tax Forms</w:t>
+            </w:r>
+            <w:r>
+              <w:rPr>
+                <w:noProof/>
+                <w:webHidden/>
+              </w:rPr>
+              <w:tab/>
+            </w:r>
+            <w:r>
+              <w:rPr>
+                <w:noProof/>
+                <w:webHidden/>
+              </w:rPr>
+              <w:fldChar w:fldCharType="begin"/>
+            </w:r>
+            <w:r>
+              <w:rPr>
+                <w:noProof/>
+                <w:webHidden/>
+              </w:rPr>
+              <w:instrText xml:space="preserve"> PAGEREF _Toc40886105 \h </w:instrText>
+            </w:r>
+            <w:r>
+              <w:rPr>
+                <w:noProof/>
+                <w:webHidden/>
+              </w:rPr>
+            </w:r>
+            <w:r>
+              <w:rPr>
+                <w:noProof/>
+                <w:webHidden/>
+              </w:rPr>
+              <w:fldChar w:fldCharType="separate"/>
+            </w:r>
+            <w:r>
+              <w:rPr>
+                <w:noProof/>
+                <w:webHidden/>
+              </w:rPr>
+              <w:t>8</w:t>
+            </w:r>
+            <w:r>
+              <w:rPr>
+                <w:noProof/>
+                <w:webHidden/>
+              </w:rPr>
+              <w:fldChar w:fldCharType="end"/>
+            </w:r>
+          </w:hyperlink>
+        </w:p>
+        <w:p>
+          <w:pPr>
+            <w:pStyle w:val="TOC1"/>
+            <w:tabs>
+              <w:tab w:val="right" w:leader="dot" w:pos="9350"/>
+            </w:tabs>
+            <w:rPr>
+              <w:noProof/>
+              <w:lang w:eastAsia="en-US"/>
+            </w:rPr>
+          </w:pPr>
+          <w:hyperlink w:anchor="_Toc40886106" w:history="1">
+            <w:r>
+              <w:rPr>
+                <w:rStyle w:val="Hyperlink"/>
+                <w:noProof/>
+              </w:rPr>
+              <w:t>Transcripts</w:t>
+            </w:r>
+            <w:r>
+              <w:rPr>
+                <w:noProof/>
+                <w:webHidden/>
+              </w:rPr>
+              <w:tab/>
+            </w:r>
+            <w:r>
+              <w:rPr>
+                <w:noProof/>
+                <w:webHidden/>
+              </w:rPr>
+              <w:fldChar w:fldCharType="begin"/>
+            </w:r>
+            <w:r>
+              <w:rPr>
+                <w:noProof/>
+                <w:webHidden/>
+              </w:rPr>
+              <w:instrText xml:space="preserve"> PAGEREF _Toc40886106 \h </w:instrText>
+            </w:r>
+            <w:r>
+              <w:rPr>
+                <w:noProof/>
+                <w:webHidden/>
+              </w:rPr>
+            </w:r>
+            <w:r>
+              <w:rPr>
+                <w:noProof/>
+                <w:webHidden/>
+              </w:rPr>
+              <w:fldChar w:fldCharType="separate"/>
+            </w:r>
+            <w:r>
+              <w:rPr>
+                <w:noProof/>
+                <w:webHidden/>
+              </w:rPr>
+              <w:t>9</w:t>
+            </w:r>
+            <w:r>
+              <w:rPr>
+                <w:noProof/>
+                <w:webHidden/>
+              </w:rPr>
+              <w:fldChar w:fldCharType="end"/>
+            </w:r>
+          </w:hyperlink>
+        </w:p>
+        <w:p>
+          <w:pPr>
+            <w:pStyle w:val="TOC1"/>
+            <w:tabs>
+              <w:tab w:val="right" w:leader="dot" w:pos="9350"/>
+            </w:tabs>
+            <w:rPr>
+              <w:noProof/>
+              <w:lang w:eastAsia="en-US"/>
+            </w:rPr>
+          </w:pPr>
+          <w:hyperlink w:anchor="_Toc40886107" w:history="1">
+            <w:r>
+              <w:rPr>
+                <w:rStyle w:val="Hyperlink"/>
+                <w:noProof/>
+              </w:rPr>
+              <w:t>Server and Email Configuration</w:t>
+            </w:r>
+            <w:r>
+              <w:rPr>
+                <w:noProof/>
+                <w:webHidden/>
+              </w:rPr>
+              <w:tab/>
+            </w:r>
+            <w:r>
+              <w:rPr>
+                <w:noProof/>
+                <w:webHidden/>
+              </w:rPr>
+              <w:fldChar w:fldCharType="begin"/>
+            </w:r>
+            <w:r>
+              <w:rPr>
+                <w:noProof/>
+                <w:webHidden/>
+              </w:rPr>
+              <w:instrText xml:space="preserve"> PAGEREF _Toc40886107 \h </w:instrText>
+            </w:r>
+            <w:r>
+              <w:rPr>
+                <w:noProof/>
+                <w:webHidden/>
+              </w:rPr>
+            </w:r>
+            <w:r>
+              <w:rPr>
+                <w:noProof/>
+                <w:webHidden/>
+              </w:rPr>
+              <w:fldChar w:fldCharType="separate"/>
+            </w:r>
+            <w:r>
+              <w:rPr>
+                <w:noProof/>
+                <w:webHidden/>
+              </w:rPr>
+              <w:t>10</w:t>
             </w:r>
             <w:r>
               <w:rPr>
@@ -743,13 +1162,13 @@
               <w:lang w:eastAsia="en-US"/>
             </w:rPr>
           </w:pPr>
-          <w:hyperlink w:anchor="_Toc40883755" w:history="1">
+          <w:hyperlink w:anchor="_Toc40886108" w:history="1">
             <w:r>
               <w:rPr>
                 <w:rStyle w:val="Hyperlink"/>
                 <w:noProof/>
               </w:rPr>
-              <w:t>HCA Bundles</w:t>
+              <w:t>Email addresses in use</w:t>
             </w:r>
             <w:r>
               <w:rPr>
@@ -770,7 +1189,7 @@
                 <w:noProof/>
                 <w:webHidden/>
               </w:rPr>
-              <w:instrText xml:space="preserve"> PAGEREF _Toc40883755 \h </w:instrText>
+              <w:instrText xml:space="preserve"> PAGEREF _Toc40886108 \h </w:instrText>
             </w:r>
             <w:r>
               <w:rPr>
@@ -790,7 +1209,7 @@
                 <w:noProof/>
                 <w:webHidden/>
               </w:rPr>
-              <w:t>6</w:t>
+              <w:t>10</w:t>
             </w:r>
             <w:r>
               <w:rPr>
@@ -812,13 +1231,13 @@
               <w:lang w:eastAsia="en-US"/>
             </w:rPr>
           </w:pPr>
-          <w:hyperlink w:anchor="_Toc40883756" w:history="1">
+          <w:hyperlink w:anchor="_Toc40886109" w:history="1">
             <w:r>
               <w:rPr>
                 <w:rStyle w:val="Hyperlink"/>
                 <w:noProof/>
               </w:rPr>
-              <w:t>First Aid and CPR Training for HCA Students</w:t>
+              <w:t>Server Configuration</w:t>
             </w:r>
             <w:r>
               <w:rPr>
@@ -839,7 +1258,7 @@
                 <w:noProof/>
                 <w:webHidden/>
               </w:rPr>
-              <w:instrText xml:space="preserve"> PAGEREF _Toc40883756 \h </w:instrText>
+              <w:instrText xml:space="preserve"> PAGEREF _Toc40886109 \h </w:instrText>
             </w:r>
             <w:r>
               <w:rPr>
@@ -859,7 +1278,7 @@
                 <w:noProof/>
                 <w:webHidden/>
               </w:rPr>
-              <w:t>7</w:t>
+              <w:t>10</w:t>
             </w:r>
             <w:r>
               <w:rPr>
@@ -881,13 +1300,13 @@
               <w:lang w:eastAsia="en-US"/>
             </w:rPr>
           </w:pPr>
-          <w:hyperlink w:anchor="_Toc40883757" w:history="1">
+          <w:hyperlink w:anchor="_Toc40886110" w:history="1">
             <w:r>
               <w:rPr>
                 <w:rStyle w:val="Hyperlink"/>
                 <w:noProof/>
               </w:rPr>
-              <w:t>Data Witness</w:t>
+              <w:t>Wireless Internet Issues</w:t>
             </w:r>
             <w:r>
               <w:rPr>
@@ -908,7 +1327,7 @@
                 <w:noProof/>
                 <w:webHidden/>
               </w:rPr>
-              <w:instrText xml:space="preserve"> PAGEREF _Toc40883757 \h </w:instrText>
+              <w:instrText xml:space="preserve"> PAGEREF _Toc40886110 \h </w:instrText>
             </w:r>
             <w:r>
               <w:rPr>
@@ -928,7 +1347,7 @@
                 <w:noProof/>
                 <w:webHidden/>
               </w:rPr>
-              <w:t>7</w:t>
+              <w:t>11</w:t>
             </w:r>
             <w:r>
               <w:rPr>
@@ -950,13 +1369,13 @@
               <w:lang w:eastAsia="en-US"/>
             </w:rPr>
           </w:pPr>
-          <w:hyperlink w:anchor="_Toc40883758" w:history="1">
+          <w:hyperlink w:anchor="_Toc40886111" w:history="1">
             <w:r>
               <w:rPr>
                 <w:rStyle w:val="Hyperlink"/>
                 <w:noProof/>
               </w:rPr>
-              <w:t>Exam Invigilations</w:t>
+              <w:t>Printers</w:t>
             </w:r>
             <w:r>
               <w:rPr>
@@ -977,7 +1396,7 @@
                 <w:noProof/>
                 <w:webHidden/>
               </w:rPr>
-              <w:instrText xml:space="preserve"> PAGEREF _Toc40883758 \h </w:instrText>
+              <w:instrText xml:space="preserve"> PAGEREF _Toc40886111 \h </w:instrText>
             </w:r>
             <w:r>
               <w:rPr>
@@ -997,7 +1416,7 @@
                 <w:noProof/>
                 <w:webHidden/>
               </w:rPr>
-              <w:t>8</w:t>
+              <w:t>12</w:t>
             </w:r>
             <w:r>
               <w:rPr>
@@ -1019,13 +1438,13 @@
               <w:lang w:eastAsia="en-US"/>
             </w:rPr>
           </w:pPr>
-          <w:hyperlink w:anchor="_Toc40883759" w:history="1">
+          <w:hyperlink w:anchor="_Toc40886112" w:history="1">
             <w:r>
               <w:rPr>
                 <w:rStyle w:val="Hyperlink"/>
                 <w:noProof/>
               </w:rPr>
-              <w:t>Booking an Exam</w:t>
+              <w:t>Brother HL5370DW</w:t>
             </w:r>
             <w:r>
               <w:rPr>
@@ -1046,7 +1465,7 @@
                 <w:noProof/>
                 <w:webHidden/>
               </w:rPr>
-              <w:instrText xml:space="preserve"> PAGEREF _Toc40883759 \h </w:instrText>
+              <w:instrText xml:space="preserve"> PAGEREF _Toc40886112 \h </w:instrText>
             </w:r>
             <w:r>
               <w:rPr>
@@ -1066,7 +1485,7 @@
                 <w:noProof/>
                 <w:webHidden/>
               </w:rPr>
-              <w:t>8</w:t>
+              <w:t>12</w:t>
             </w:r>
             <w:r>
               <w:rPr>
@@ -1088,13 +1507,13 @@
               <w:lang w:eastAsia="en-US"/>
             </w:rPr>
           </w:pPr>
-          <w:hyperlink w:anchor="_Toc40883760" w:history="1">
+          <w:hyperlink w:anchor="_Toc40886113" w:history="1">
             <w:r>
               <w:rPr>
                 <w:rStyle w:val="Hyperlink"/>
                 <w:noProof/>
               </w:rPr>
-              <w:t>The Day of the Exam</w:t>
+              <w:t>Brother MFC-8460N</w:t>
             </w:r>
             <w:r>
               <w:rPr>
@@ -1115,7 +1534,7 @@
                 <w:noProof/>
                 <w:webHidden/>
               </w:rPr>
-              <w:instrText xml:space="preserve"> PAGEREF _Toc40883760 \h </w:instrText>
+              <w:instrText xml:space="preserve"> PAGEREF _Toc40886113 \h </w:instrText>
             </w:r>
             <w:r>
               <w:rPr>
@@ -1135,7 +1554,7 @@
                 <w:noProof/>
                 <w:webHidden/>
               </w:rPr>
-              <w:t>9</w:t>
+              <w:t>12</w:t>
             </w:r>
             <w:r>
               <w:rPr>
@@ -1157,13 +1576,13 @@
               <w:lang w:eastAsia="en-US"/>
             </w:rPr>
           </w:pPr>
-          <w:hyperlink w:anchor="_Toc40883761" w:history="1">
+          <w:hyperlink w:anchor="_Toc40886114" w:history="1">
             <w:r>
               <w:rPr>
                 <w:rStyle w:val="Hyperlink"/>
                 <w:noProof/>
               </w:rPr>
-              <w:t>Order of Documents in Student Folder (Active)</w:t>
+              <w:t>Activating Office 2010 Manually</w:t>
             </w:r>
             <w:r>
               <w:rPr>
@@ -1184,7 +1603,7 @@
                 <w:noProof/>
                 <w:webHidden/>
               </w:rPr>
-              <w:instrText xml:space="preserve"> PAGEREF _Toc40883761 \h </w:instrText>
+              <w:instrText xml:space="preserve"> PAGEREF _Toc40886114 \h </w:instrText>
             </w:r>
             <w:r>
               <w:rPr>
@@ -1204,7 +1623,76 @@
                 <w:noProof/>
                 <w:webHidden/>
               </w:rPr>
-              <w:t>9</w:t>
+              <w:t>13</w:t>
+            </w:r>
+            <w:r>
+              <w:rPr>
+                <w:noProof/>
+                <w:webHidden/>
+              </w:rPr>
+              <w:fldChar w:fldCharType="end"/>
+            </w:r>
+          </w:hyperlink>
+        </w:p>
+        <w:p>
+          <w:pPr>
+            <w:pStyle w:val="TOC2"/>
+            <w:tabs>
+              <w:tab w:val="right" w:leader="dot" w:pos="9350"/>
+            </w:tabs>
+            <w:rPr>
+              <w:noProof/>
+              <w:lang w:eastAsia="en-US"/>
+            </w:rPr>
+          </w:pPr>
+          <w:hyperlink w:anchor="_Toc40886115" w:history="1">
+            <w:r>
+              <w:rPr>
+                <w:rStyle w:val="Hyperlink"/>
+                <w:noProof/>
+              </w:rPr>
+              <w:t>Activate Office Using OSPP.VBS</w:t>
+            </w:r>
+            <w:r>
+              <w:rPr>
+                <w:noProof/>
+                <w:webHidden/>
+              </w:rPr>
+              <w:tab/>
+            </w:r>
+            <w:r>
+              <w:rPr>
+                <w:noProof/>
+                <w:webHidden/>
+              </w:rPr>
+              <w:fldChar w:fldCharType="begin"/>
+            </w:r>
+            <w:r>
+              <w:rPr>
+                <w:noProof/>
+                <w:webHidden/>
+              </w:rPr>
+              <w:instrText xml:space="preserve"> PAGEREF _Toc40886115 \h </w:instrText>
+            </w:r>
+            <w:r>
+              <w:rPr>
+                <w:noProof/>
+                <w:webHidden/>
+              </w:rPr>
+            </w:r>
+            <w:r>
+              <w:rPr>
+                <w:noProof/>
+                <w:webHidden/>
+              </w:rPr>
+              <w:fldChar w:fldCharType="separate"/>
+            </w:r>
+            <w:r>
+              <w:rPr>
+                <w:noProof/>
+                <w:webHidden/>
+              </w:rPr>
+              <w:t>13</w:t>
             </w:r>
             <w:r>
               <w:rPr>
@@ -1226,13 +1714,13 @@
               <w:lang w:eastAsia="en-US"/>
             </w:rPr>
           </w:pPr>
-          <w:hyperlink w:anchor="_Toc40883762" w:history="1">
+          <w:hyperlink w:anchor="_Toc40886116" w:history="1">
             <w:r>
               <w:rPr>
                 <w:rStyle w:val="Hyperlink"/>
                 <w:noProof/>
               </w:rPr>
-              <w:t>Order of Documents in Student Folder (Closed)</w:t>
+              <w:t>ACME Login Errors – Security Permissions</w:t>
             </w:r>
             <w:r>
               <w:rPr>
@@ -1253,7 +1741,7 @@
                 <w:noProof/>
                 <w:webHidden/>
               </w:rPr>
-              <w:instrText xml:space="preserve"> PAGEREF _Toc40883762 \h </w:instrText>
+              <w:instrText xml:space="preserve"> PAGEREF _Toc40886116 \h </w:instrText>
             </w:r>
             <w:r>
               <w:rPr>
@@ -1273,835 +1761,7 @@
                 <w:noProof/>
                 <w:webHidden/>
               </w:rPr>
-              <w:t>9</w:t>
-            </w:r>
-            <w:r>
-              <w:rPr>
-                <w:noProof/>
-                <w:webHidden/>
-              </w:rPr>
-              <w:fldChar w:fldCharType="end"/>
-            </w:r>
-          </w:hyperlink>
-        </w:p>
-        <w:p>
-          <w:pPr>
-            <w:pStyle w:val="TOC1"/>
-            <w:tabs>
-              <w:tab w:val="right" w:leader="dot" w:pos="9350"/>
-            </w:tabs>
-            <w:rPr>
-              <w:noProof/>
-              <w:lang w:eastAsia="en-US"/>
-            </w:rPr>
-          </w:pPr>
-          <w:hyperlink w:anchor="_Toc40883763" w:history="1">
-            <w:r>
-              <w:rPr>
-                <w:rStyle w:val="Hyperlink"/>
-                <w:noProof/>
-              </w:rPr>
-              <w:t>T2202A Tax Forms</w:t>
-            </w:r>
-            <w:r>
-              <w:rPr>
-                <w:noProof/>
-                <w:webHidden/>
-              </w:rPr>
-              <w:tab/>
-            </w:r>
-            <w:r>
-              <w:rPr>
-                <w:noProof/>
-                <w:webHidden/>
-              </w:rPr>
-              <w:fldChar w:fldCharType="begin"/>
-            </w:r>
-            <w:r>
-              <w:rPr>
-                <w:noProof/>
-                <w:webHidden/>
-              </w:rPr>
-              <w:instrText xml:space="preserve"> PAGEREF _Toc40883763 \h </w:instrText>
-            </w:r>
-            <w:r>
-              <w:rPr>
-                <w:noProof/>
-                <w:webHidden/>
-              </w:rPr>
-            </w:r>
-            <w:r>
-              <w:rPr>
-                <w:noProof/>
-                <w:webHidden/>
-              </w:rPr>
-              <w:fldChar w:fldCharType="separate"/>
-            </w:r>
-            <w:r>
-              <w:rPr>
-                <w:noProof/>
-                <w:webHidden/>
-              </w:rPr>
-              <w:t>10</w:t>
-            </w:r>
-            <w:r>
-              <w:rPr>
-                <w:noProof/>
-                <w:webHidden/>
-              </w:rPr>
-              <w:fldChar w:fldCharType="end"/>
-            </w:r>
-          </w:hyperlink>
-        </w:p>
-        <w:p>
-          <w:pPr>
-            <w:pStyle w:val="TOC1"/>
-            <w:tabs>
-              <w:tab w:val="right" w:leader="dot" w:pos="9350"/>
-            </w:tabs>
-            <w:rPr>
-              <w:noProof/>
-              <w:lang w:eastAsia="en-US"/>
-            </w:rPr>
-          </w:pPr>
-          <w:hyperlink w:anchor="_Toc40883764" w:history="1">
-            <w:r>
-              <w:rPr>
-                <w:rStyle w:val="Hyperlink"/>
-                <w:noProof/>
-              </w:rPr>
-              <w:t>Transcripts</w:t>
-            </w:r>
-            <w:r>
-              <w:rPr>
-                <w:noProof/>
-                <w:webHidden/>
-              </w:rPr>
-              <w:tab/>
-            </w:r>
-            <w:r>
-              <w:rPr>
-                <w:noProof/>
-                <w:webHidden/>
-              </w:rPr>
-              <w:fldChar w:fldCharType="begin"/>
-            </w:r>
-            <w:r>
-              <w:rPr>
-                <w:noProof/>
-                <w:webHidden/>
-              </w:rPr>
-              <w:instrText xml:space="preserve"> PAGEREF _Toc40883764 \h </w:instrText>
-            </w:r>
-            <w:r>
-              <w:rPr>
-                <w:noProof/>
-                <w:webHidden/>
-              </w:rPr>
-            </w:r>
-            <w:r>
-              <w:rPr>
-                <w:noProof/>
-                <w:webHidden/>
-              </w:rPr>
-              <w:fldChar w:fldCharType="separate"/>
-            </w:r>
-            <w:r>
-              <w:rPr>
-                <w:noProof/>
-                <w:webHidden/>
-              </w:rPr>
-              <w:t>10</w:t>
-            </w:r>
-            <w:r>
-              <w:rPr>
-                <w:noProof/>
-                <w:webHidden/>
-              </w:rPr>
-              <w:fldChar w:fldCharType="end"/>
-            </w:r>
-          </w:hyperlink>
-        </w:p>
-        <w:p>
-          <w:pPr>
-            <w:pStyle w:val="TOC1"/>
-            <w:tabs>
-              <w:tab w:val="right" w:leader="dot" w:pos="9350"/>
-            </w:tabs>
-            <w:rPr>
-              <w:noProof/>
-              <w:lang w:eastAsia="en-US"/>
-            </w:rPr>
-          </w:pPr>
-          <w:hyperlink w:anchor="_Toc40883765" w:history="1">
-            <w:r>
-              <w:rPr>
-                <w:rStyle w:val="Hyperlink"/>
-                <w:noProof/>
-              </w:rPr>
-              <w:t>Server and Email Configuration</w:t>
-            </w:r>
-            <w:r>
-              <w:rPr>
-                <w:noProof/>
-                <w:webHidden/>
-              </w:rPr>
-              <w:tab/>
-            </w:r>
-            <w:r>
-              <w:rPr>
-                <w:noProof/>
-                <w:webHidden/>
-              </w:rPr>
-              <w:fldChar w:fldCharType="begin"/>
-            </w:r>
-            <w:r>
-              <w:rPr>
-                <w:noProof/>
-                <w:webHidden/>
-              </w:rPr>
-              <w:instrText xml:space="preserve"> PAGEREF _Toc40883765 \h </w:instrText>
-            </w:r>
-            <w:r>
-              <w:rPr>
-                <w:noProof/>
-                <w:webHidden/>
-              </w:rPr>
-            </w:r>
-            <w:r>
-              <w:rPr>
-                <w:noProof/>
-                <w:webHidden/>
-              </w:rPr>
-              <w:fldChar w:fldCharType="separate"/>
-            </w:r>
-            <w:r>
-              <w:rPr>
-                <w:noProof/>
-                <w:webHidden/>
-              </w:rPr>
-              <w:t>12</w:t>
-            </w:r>
-            <w:r>
-              <w:rPr>
-                <w:noProof/>
-                <w:webHidden/>
-              </w:rPr>
-              <w:fldChar w:fldCharType="end"/>
-            </w:r>
-          </w:hyperlink>
-        </w:p>
-        <w:p>
-          <w:pPr>
-            <w:pStyle w:val="TOC2"/>
-            <w:tabs>
-              <w:tab w:val="right" w:leader="dot" w:pos="9350"/>
-            </w:tabs>
-            <w:rPr>
-              <w:noProof/>
-              <w:lang w:eastAsia="en-US"/>
-            </w:rPr>
-          </w:pPr>
-          <w:hyperlink w:anchor="_Toc40883766" w:history="1">
-            <w:r>
-              <w:rPr>
-                <w:rStyle w:val="Hyperlink"/>
-                <w:noProof/>
-              </w:rPr>
-              <w:t>Email addresses in use</w:t>
-            </w:r>
-            <w:r>
-              <w:rPr>
-                <w:noProof/>
-                <w:webHidden/>
-              </w:rPr>
-              <w:tab/>
-            </w:r>
-            <w:r>
-              <w:rPr>
-                <w:noProof/>
-                <w:webHidden/>
-              </w:rPr>
-              <w:fldChar w:fldCharType="begin"/>
-            </w:r>
-            <w:r>
-              <w:rPr>
-                <w:noProof/>
-                <w:webHidden/>
-              </w:rPr>
-              <w:instrText xml:space="preserve"> PAGEREF _Toc40883766 \h </w:instrText>
-            </w:r>
-            <w:r>
-              <w:rPr>
-                <w:noProof/>
-                <w:webHidden/>
-              </w:rPr>
-            </w:r>
-            <w:r>
-              <w:rPr>
-                <w:noProof/>
-                <w:webHidden/>
-              </w:rPr>
-              <w:fldChar w:fldCharType="separate"/>
-            </w:r>
-            <w:r>
-              <w:rPr>
-                <w:noProof/>
-                <w:webHidden/>
-              </w:rPr>
-              <w:t>12</w:t>
-            </w:r>
-            <w:r>
-              <w:rPr>
-                <w:noProof/>
-                <w:webHidden/>
-              </w:rPr>
-              <w:fldChar w:fldCharType="end"/>
-            </w:r>
-          </w:hyperlink>
-        </w:p>
-        <w:p>
-          <w:pPr>
-            <w:pStyle w:val="TOC2"/>
-            <w:tabs>
-              <w:tab w:val="right" w:leader="dot" w:pos="9350"/>
-            </w:tabs>
-            <w:rPr>
-              <w:noProof/>
-              <w:lang w:eastAsia="en-US"/>
-            </w:rPr>
-          </w:pPr>
-          <w:hyperlink w:anchor="_Toc40883767" w:history="1">
-            <w:r>
-              <w:rPr>
-                <w:rStyle w:val="Hyperlink"/>
-                <w:noProof/>
-              </w:rPr>
-              <w:t>Server Configuration</w:t>
-            </w:r>
-            <w:r>
-              <w:rPr>
-                <w:noProof/>
-                <w:webHidden/>
-              </w:rPr>
-              <w:tab/>
-            </w:r>
-            <w:r>
-              <w:rPr>
-                <w:noProof/>
-                <w:webHidden/>
-              </w:rPr>
-              <w:fldChar w:fldCharType="begin"/>
-            </w:r>
-            <w:r>
-              <w:rPr>
-                <w:noProof/>
-                <w:webHidden/>
-              </w:rPr>
-              <w:instrText xml:space="preserve"> PAGEREF _Toc40883767 \h </w:instrText>
-            </w:r>
-            <w:r>
-              <w:rPr>
-                <w:noProof/>
-                <w:webHidden/>
-              </w:rPr>
-            </w:r>
-            <w:r>
-              <w:rPr>
-                <w:noProof/>
-                <w:webHidden/>
-              </w:rPr>
-              <w:fldChar w:fldCharType="separate"/>
-            </w:r>
-            <w:r>
-              <w:rPr>
-                <w:noProof/>
-                <w:webHidden/>
-              </w:rPr>
-              <w:t>12</w:t>
-            </w:r>
-            <w:r>
-              <w:rPr>
-                <w:noProof/>
-                <w:webHidden/>
-              </w:rPr>
-              <w:fldChar w:fldCharType="end"/>
-            </w:r>
-          </w:hyperlink>
-        </w:p>
-        <w:p>
-          <w:pPr>
-            <w:pStyle w:val="TOC1"/>
-            <w:tabs>
-              <w:tab w:val="right" w:leader="dot" w:pos="9350"/>
-            </w:tabs>
-            <w:rPr>
-              <w:noProof/>
-              <w:lang w:eastAsia="en-US"/>
-            </w:rPr>
-          </w:pPr>
-          <w:hyperlink w:anchor="_Toc40883768" w:history="1">
-            <w:r>
-              <w:rPr>
-                <w:rStyle w:val="Hyperlink"/>
-                <w:noProof/>
-              </w:rPr>
-              <w:t>Wireless Internet Issues</w:t>
-            </w:r>
-            <w:r>
-              <w:rPr>
-                <w:noProof/>
-                <w:webHidden/>
-              </w:rPr>
-              <w:tab/>
-            </w:r>
-            <w:r>
-              <w:rPr>
-                <w:noProof/>
-                <w:webHidden/>
-              </w:rPr>
-              <w:fldChar w:fldCharType="begin"/>
-            </w:r>
-            <w:r>
-              <w:rPr>
-                <w:noProof/>
-                <w:webHidden/>
-              </w:rPr>
-              <w:instrText xml:space="preserve"> PAGEREF _Toc40883768 \h </w:instrText>
-            </w:r>
-            <w:r>
-              <w:rPr>
-                <w:noProof/>
-                <w:webHidden/>
-              </w:rPr>
-            </w:r>
-            <w:r>
-              <w:rPr>
-                <w:noProof/>
-                <w:webHidden/>
-              </w:rPr>
-              <w:fldChar w:fldCharType="separate"/>
-            </w:r>
-            <w:r>
-              <w:rPr>
-                <w:noProof/>
-                <w:webHidden/>
-              </w:rPr>
               <w:t>13</w:t>
-            </w:r>
-            <w:r>
-              <w:rPr>
-                <w:noProof/>
-                <w:webHidden/>
-              </w:rPr>
-              <w:fldChar w:fldCharType="end"/>
-            </w:r>
-          </w:hyperlink>
-        </w:p>
-        <w:p>
-          <w:pPr>
-            <w:pStyle w:val="TOC1"/>
-            <w:tabs>
-              <w:tab w:val="right" w:leader="dot" w:pos="9350"/>
-            </w:tabs>
-            <w:rPr>
-              <w:noProof/>
-              <w:lang w:eastAsia="en-US"/>
-            </w:rPr>
-          </w:pPr>
-          <w:hyperlink w:anchor="_Toc40883769" w:history="1">
-            <w:r>
-              <w:rPr>
-                <w:rStyle w:val="Hyperlink"/>
-                <w:noProof/>
-              </w:rPr>
-              <w:t>Printers</w:t>
-            </w:r>
-            <w:r>
-              <w:rPr>
-                <w:noProof/>
-                <w:webHidden/>
-              </w:rPr>
-              <w:tab/>
-            </w:r>
-            <w:r>
-              <w:rPr>
-                <w:noProof/>
-                <w:webHidden/>
-              </w:rPr>
-              <w:fldChar w:fldCharType="begin"/>
-            </w:r>
-            <w:r>
-              <w:rPr>
-                <w:noProof/>
-                <w:webHidden/>
-              </w:rPr>
-              <w:instrText xml:space="preserve"> PAGEREF _Toc40883769 \h </w:instrText>
-            </w:r>
-            <w:r>
-              <w:rPr>
-                <w:noProof/>
-                <w:webHidden/>
-              </w:rPr>
-            </w:r>
-            <w:r>
-              <w:rPr>
-                <w:noProof/>
-                <w:webHidden/>
-              </w:rPr>
-              <w:fldChar w:fldCharType="separate"/>
-            </w:r>
-            <w:r>
-              <w:rPr>
-                <w:noProof/>
-                <w:webHidden/>
-              </w:rPr>
-              <w:t>14</w:t>
-            </w:r>
-            <w:r>
-              <w:rPr>
-                <w:noProof/>
-                <w:webHidden/>
-              </w:rPr>
-              <w:fldChar w:fldCharType="end"/>
-            </w:r>
-          </w:hyperlink>
-        </w:p>
-        <w:p>
-          <w:pPr>
-            <w:pStyle w:val="TOC2"/>
-            <w:tabs>
-              <w:tab w:val="right" w:leader="dot" w:pos="9350"/>
-            </w:tabs>
-            <w:rPr>
-              <w:noProof/>
-              <w:lang w:eastAsia="en-US"/>
-            </w:rPr>
-          </w:pPr>
-          <w:hyperlink w:anchor="_Toc40883770" w:history="1">
-            <w:r>
-              <w:rPr>
-                <w:rStyle w:val="Hyperlink"/>
-                <w:noProof/>
-              </w:rPr>
-              <w:t>Brother HL5370DW</w:t>
-            </w:r>
-            <w:r>
-              <w:rPr>
-                <w:noProof/>
-                <w:webHidden/>
-              </w:rPr>
-              <w:tab/>
-            </w:r>
-            <w:r>
-              <w:rPr>
-                <w:noProof/>
-                <w:webHidden/>
-              </w:rPr>
-              <w:fldChar w:fldCharType="begin"/>
-            </w:r>
-            <w:r>
-              <w:rPr>
-                <w:noProof/>
-                <w:webHidden/>
-              </w:rPr>
-              <w:instrText xml:space="preserve"> PAGEREF _Toc40883770 \h </w:instrText>
-            </w:r>
-            <w:r>
-              <w:rPr>
-                <w:noProof/>
-                <w:webHidden/>
-              </w:rPr>
-            </w:r>
-            <w:r>
-              <w:rPr>
-                <w:noProof/>
-                <w:webHidden/>
-              </w:rPr>
-              <w:fldChar w:fldCharType="separate"/>
-            </w:r>
-            <w:r>
-              <w:rPr>
-                <w:noProof/>
-                <w:webHidden/>
-              </w:rPr>
-              <w:t>14</w:t>
-            </w:r>
-            <w:r>
-              <w:rPr>
-                <w:noProof/>
-                <w:webHidden/>
-              </w:rPr>
-              <w:fldChar w:fldCharType="end"/>
-            </w:r>
-          </w:hyperlink>
-        </w:p>
-        <w:p>
-          <w:pPr>
-            <w:pStyle w:val="TOC2"/>
-            <w:tabs>
-              <w:tab w:val="right" w:leader="dot" w:pos="9350"/>
-            </w:tabs>
-            <w:rPr>
-              <w:noProof/>
-              <w:lang w:eastAsia="en-US"/>
-            </w:rPr>
-          </w:pPr>
-          <w:hyperlink w:anchor="_Toc40883771" w:history="1">
-            <w:r>
-              <w:rPr>
-                <w:rStyle w:val="Hyperlink"/>
-                <w:noProof/>
-              </w:rPr>
-              <w:t>Brother MFC-8460N</w:t>
-            </w:r>
-            <w:r>
-              <w:rPr>
-                <w:noProof/>
-                <w:webHidden/>
-              </w:rPr>
-              <w:tab/>
-            </w:r>
-            <w:r>
-              <w:rPr>
-                <w:noProof/>
-                <w:webHidden/>
-              </w:rPr>
-              <w:fldChar w:fldCharType="begin"/>
-            </w:r>
-            <w:r>
-              <w:rPr>
-                <w:noProof/>
-                <w:webHidden/>
-              </w:rPr>
-              <w:instrText xml:space="preserve"> PAGEREF _Toc40883771 \h </w:instrText>
-            </w:r>
-            <w:r>
-              <w:rPr>
-                <w:noProof/>
-                <w:webHidden/>
-              </w:rPr>
-            </w:r>
-            <w:r>
-              <w:rPr>
-                <w:noProof/>
-                <w:webHidden/>
-              </w:rPr>
-              <w:fldChar w:fldCharType="separate"/>
-            </w:r>
-            <w:r>
-              <w:rPr>
-                <w:noProof/>
-                <w:webHidden/>
-              </w:rPr>
-              <w:t>14</w:t>
-            </w:r>
-            <w:r>
-              <w:rPr>
-                <w:noProof/>
-                <w:webHidden/>
-              </w:rPr>
-              <w:fldChar w:fldCharType="end"/>
-            </w:r>
-          </w:hyperlink>
-        </w:p>
-        <w:p>
-          <w:pPr>
-            <w:pStyle w:val="TOC1"/>
-            <w:tabs>
-              <w:tab w:val="right" w:leader="dot" w:pos="9350"/>
-            </w:tabs>
-            <w:rPr>
-              <w:noProof/>
-              <w:lang w:eastAsia="en-US"/>
-            </w:rPr>
-          </w:pPr>
-          <w:hyperlink w:anchor="_Toc40883772" w:history="1">
-            <w:r>
-              <w:rPr>
-                <w:rStyle w:val="Hyperlink"/>
-                <w:noProof/>
-              </w:rPr>
-              <w:t>Activating Office 2010 Manually</w:t>
-            </w:r>
-            <w:r>
-              <w:rPr>
-                <w:noProof/>
-                <w:webHidden/>
-              </w:rPr>
-              <w:tab/>
-            </w:r>
-            <w:r>
-              <w:rPr>
-                <w:noProof/>
-                <w:webHidden/>
-              </w:rPr>
-              <w:fldChar w:fldCharType="begin"/>
-            </w:r>
-            <w:r>
-              <w:rPr>
-                <w:noProof/>
-                <w:webHidden/>
-              </w:rPr>
-              <w:instrText xml:space="preserve"> PAGEREF _Toc40883772 \h </w:instrText>
-            </w:r>
-            <w:r>
-              <w:rPr>
-                <w:noProof/>
-                <w:webHidden/>
-              </w:rPr>
-            </w:r>
-            <w:r>
-              <w:rPr>
-                <w:noProof/>
-                <w:webHidden/>
-              </w:rPr>
-              <w:fldChar w:fldCharType="separate"/>
-            </w:r>
-            <w:r>
-              <w:rPr>
-                <w:noProof/>
-                <w:webHidden/>
-              </w:rPr>
-              <w:t>15</w:t>
-            </w:r>
-            <w:r>
-              <w:rPr>
-                <w:noProof/>
-                <w:webHidden/>
-              </w:rPr>
-              <w:fldChar w:fldCharType="end"/>
-            </w:r>
-          </w:hyperlink>
-        </w:p>
-        <w:p>
-          <w:pPr>
-            <w:pStyle w:val="TOC2"/>
-            <w:tabs>
-              <w:tab w:val="right" w:leader="dot" w:pos="9350"/>
-            </w:tabs>
-            <w:rPr>
-              <w:noProof/>
-              <w:lang w:eastAsia="en-US"/>
-            </w:rPr>
-          </w:pPr>
-          <w:hyperlink w:anchor="_Toc40883773" w:history="1">
-            <w:r>
-              <w:rPr>
-                <w:rStyle w:val="Hyperlink"/>
-                <w:noProof/>
-              </w:rPr>
-              <w:t>Activate Office Using OSPP.VBS</w:t>
-            </w:r>
-            <w:r>
-              <w:rPr>
-                <w:noProof/>
-                <w:webHidden/>
-              </w:rPr>
-              <w:tab/>
-            </w:r>
-            <w:r>
-              <w:rPr>
-                <w:noProof/>
-                <w:webHidden/>
-              </w:rPr>
-              <w:fldChar w:fldCharType="begin"/>
-            </w:r>
-            <w:r>
-              <w:rPr>
-                <w:noProof/>
-                <w:webHidden/>
-              </w:rPr>
-              <w:instrText xml:space="preserve"> PAGEREF _Toc40883773 \h </w:instrText>
-            </w:r>
-            <w:r>
-              <w:rPr>
-                <w:noProof/>
-                <w:webHidden/>
-              </w:rPr>
-            </w:r>
-            <w:r>
-              <w:rPr>
-                <w:noProof/>
-                <w:webHidden/>
-              </w:rPr>
-              <w:fldChar w:fldCharType="separate"/>
-            </w:r>
-            <w:r>
-              <w:rPr>
-                <w:noProof/>
-                <w:webHidden/>
-              </w:rPr>
-              <w:t>15</w:t>
-            </w:r>
-            <w:r>
-              <w:rPr>
-                <w:noProof/>
-                <w:webHidden/>
-              </w:rPr>
-              <w:fldChar w:fldCharType="end"/>
-            </w:r>
-          </w:hyperlink>
-        </w:p>
-        <w:p>
-          <w:pPr>
-            <w:pStyle w:val="TOC1"/>
-            <w:tabs>
-              <w:tab w:val="right" w:leader="dot" w:pos="9350"/>
-            </w:tabs>
-            <w:rPr>
-              <w:noProof/>
-              <w:lang w:eastAsia="en-US"/>
-            </w:rPr>
-          </w:pPr>
-          <w:hyperlink w:anchor="_Toc40883774" w:history="1">
-            <w:r>
-              <w:rPr>
-                <w:rStyle w:val="Hyperlink"/>
-                <w:noProof/>
-              </w:rPr>
-              <w:t>ACME Login Errors – Security Permissions</w:t>
-            </w:r>
-            <w:r>
-              <w:rPr>
-                <w:noProof/>
-                <w:webHidden/>
-              </w:rPr>
-              <w:tab/>
-            </w:r>
-            <w:r>
-              <w:rPr>
-                <w:noProof/>
-                <w:webHidden/>
-              </w:rPr>
-              <w:fldChar w:fldCharType="begin"/>
-            </w:r>
-            <w:r>
-              <w:rPr>
-                <w:noProof/>
-                <w:webHidden/>
-              </w:rPr>
-              <w:instrText xml:space="preserve"> PAGEREF _Toc40883774 \h </w:instrText>
-            </w:r>
-            <w:r>
-              <w:rPr>
-                <w:noProof/>
-                <w:webHidden/>
-              </w:rPr>
-            </w:r>
-            <w:r>
-              <w:rPr>
-                <w:noProof/>
-                <w:webHidden/>
-              </w:rPr>
-              <w:fldChar w:fldCharType="separate"/>
-            </w:r>
-            <w:r>
-              <w:rPr>
-                <w:noProof/>
-                <w:webHidden/>
-              </w:rPr>
-              <w:t>15</w:t>
             </w:r>
             <w:r>
               <w:rPr>
@@ -2152,12 +1812,12 @@
       <w:pPr>
         <w:pStyle w:val="Heading1"/>
       </w:pPr>
-      <w:bookmarkStart w:id="1" w:name="_Toc40883745"/>
+      <w:bookmarkStart w:id="2" w:name="_Toc40886092"/>
       <w:r>
         <w:t>Morning Procedure</w:t>
       </w:r>
       <w:bookmarkEnd w:id="0"/>
-      <w:bookmarkEnd w:id="1"/>
+      <w:bookmarkEnd w:id="2"/>
       <w:r>
         <w:fldChar w:fldCharType="begin"/>
       </w:r>
@@ -2537,14 +2197,14 @@
       <w:pPr>
         <w:pStyle w:val="Heading1"/>
       </w:pPr>
-      <w:bookmarkStart w:id="2" w:name="_Toc392495795"/>
-      <w:bookmarkStart w:id="3" w:name="_Toc40883746"/>
+      <w:bookmarkStart w:id="3" w:name="_Toc392495795"/>
+      <w:bookmarkStart w:id="4" w:name="_Toc40886093"/>
       <w:r>
         <w:lastRenderedPageBreak/>
         <w:t>Book Orders</w:t>
       </w:r>
-      <w:bookmarkEnd w:id="2"/>
       <w:bookmarkEnd w:id="3"/>
+      <w:bookmarkEnd w:id="4"/>
     </w:p>
     <w:p>
       <w:pPr>
@@ -3326,18 +2986,18 @@
       <w:pPr>
         <w:pStyle w:val="Heading1"/>
       </w:pPr>
-      <w:bookmarkStart w:id="4" w:name="_Toc355966190"/>
-      <w:bookmarkStart w:id="5" w:name="_Toc392495796"/>
+      <w:bookmarkStart w:id="5" w:name="_Toc355966190"/>
+      <w:bookmarkStart w:id="6" w:name="_Toc392495796"/>
     </w:p>
     <w:p>
       <w:pPr>
         <w:pStyle w:val="Heading1"/>
       </w:pPr>
-      <w:bookmarkStart w:id="6" w:name="_Toc40883747"/>
+      <w:bookmarkStart w:id="7" w:name="_Toc40886094"/>
       <w:r>
         <w:t>Book Projection Spreadsheet</w:t>
       </w:r>
-      <w:bookmarkEnd w:id="6"/>
+      <w:bookmarkEnd w:id="7"/>
       <w:r>
         <w:fldChar w:fldCharType="begin"/>
       </w:r>
@@ -3460,13 +3120,13 @@
       <w:pPr>
         <w:pStyle w:val="Heading1"/>
       </w:pPr>
-      <w:bookmarkStart w:id="7" w:name="_Toc40883748"/>
+      <w:bookmarkStart w:id="8" w:name="_Toc40886095"/>
       <w:r>
         <w:t>Configuring Typing Trainer</w:t>
       </w:r>
-      <w:bookmarkEnd w:id="4"/>
       <w:bookmarkEnd w:id="5"/>
-      <w:bookmarkEnd w:id="7"/>
+      <w:bookmarkEnd w:id="6"/>
+      <w:bookmarkEnd w:id="8"/>
     </w:p>
     <w:p>
       <w:pPr>
@@ -3803,20 +3463,20 @@
       <w:pPr>
         <w:pStyle w:val="Heading1"/>
       </w:pPr>
-      <w:bookmarkStart w:id="8" w:name="_Toc392495797"/>
+      <w:bookmarkStart w:id="9" w:name="_Toc392495797"/>
     </w:p>
     <w:p/>
     <w:p>
       <w:pPr>
         <w:pStyle w:val="Heading1"/>
       </w:pPr>
-      <w:bookmarkStart w:id="9" w:name="_Toc40883749"/>
-      <w:bookmarkEnd w:id="8"/>
+      <w:bookmarkStart w:id="10" w:name="_Toc40886096"/>
+      <w:bookmarkEnd w:id="9"/>
       <w:r>
         <w:lastRenderedPageBreak/>
         <w:t>Starting a New Student</w:t>
       </w:r>
-      <w:bookmarkEnd w:id="9"/>
+      <w:bookmarkEnd w:id="10"/>
     </w:p>
     <w:p>
       <w:pPr>
@@ -3845,15 +3505,15 @@
       <w:pPr>
         <w:pStyle w:val="Heading1"/>
       </w:pPr>
-      <w:bookmarkStart w:id="10" w:name="_Toc355966193"/>
-      <w:bookmarkStart w:id="11" w:name="_Toc392495798"/>
-      <w:bookmarkStart w:id="12" w:name="_Toc40883750"/>
+      <w:bookmarkStart w:id="11" w:name="_Toc355966193"/>
+      <w:bookmarkStart w:id="12" w:name="_Toc392495798"/>
+      <w:bookmarkStart w:id="13" w:name="_Toc40886097"/>
       <w:r>
         <w:t>Order of Student Files</w:t>
       </w:r>
-      <w:bookmarkEnd w:id="10"/>
       <w:bookmarkEnd w:id="11"/>
       <w:bookmarkEnd w:id="12"/>
+      <w:bookmarkEnd w:id="13"/>
     </w:p>
     <w:p>
       <w:pPr>
@@ -4614,13 +4274,13 @@
       <w:pPr>
         <w:pStyle w:val="Heading1"/>
       </w:pPr>
-      <w:bookmarkStart w:id="13" w:name="_Toc392495800"/>
-      <w:bookmarkStart w:id="14" w:name="_Toc40883751"/>
+      <w:bookmarkStart w:id="14" w:name="_Toc392495800"/>
+      <w:bookmarkStart w:id="15" w:name="_Toc40886098"/>
       <w:r>
         <w:t>Closing a File</w:t>
       </w:r>
-      <w:bookmarkEnd w:id="13"/>
       <w:bookmarkEnd w:id="14"/>
+      <w:bookmarkEnd w:id="15"/>
     </w:p>
     <w:p>
       <w:pPr>
@@ -6847,7 +6507,7 @@
         </w:rPr>
         <w:t>.  File the complete file in the designated filing cabinets under the year that matches the student file folder.</w:t>
       </w:r>
-      <w:bookmarkStart w:id="15" w:name="_Toc392495807"/>
+      <w:bookmarkStart w:id="16" w:name="_Toc392495807"/>
     </w:p>
     <w:p>
       <w:pPr>
@@ -6858,7 +6518,6 @@
           <w:szCs w:val="28"/>
         </w:rPr>
       </w:pPr>
-      <w:bookmarkStart w:id="16" w:name="_Toc40883757"/>
       <w:r>
         <w:br w:type="page"/>
       </w:r>
@@ -6867,12 +6526,13 @@
       <w:pPr>
         <w:pStyle w:val="Heading1"/>
       </w:pPr>
+      <w:bookmarkStart w:id="17" w:name="_Toc40886099"/>
       <w:r>
         <w:lastRenderedPageBreak/>
         <w:t>Data Witness</w:t>
       </w:r>
-      <w:bookmarkEnd w:id="15"/>
       <w:bookmarkEnd w:id="16"/>
+      <w:bookmarkEnd w:id="17"/>
       <w:r>
         <w:fldChar w:fldCharType="begin"/>
       </w:r>
@@ -7561,16 +7221,16 @@
       <w:pPr>
         <w:pStyle w:val="Heading1"/>
       </w:pPr>
-      <w:bookmarkStart w:id="17" w:name="_Toc392495808"/>
-      <w:bookmarkStart w:id="18" w:name="_Toc40883758"/>
+      <w:bookmarkStart w:id="18" w:name="_Toc392495808"/>
+      <w:bookmarkStart w:id="19" w:name="_Toc40886100"/>
       <w:r>
         <w:t>E</w:t>
       </w:r>
       <w:r>
         <w:t>xam Invigilations</w:t>
       </w:r>
-      <w:bookmarkEnd w:id="17"/>
       <w:bookmarkEnd w:id="18"/>
+      <w:bookmarkEnd w:id="19"/>
     </w:p>
     <w:p/>
     <w:p>
@@ -7721,16 +7381,16 @@
       <w:pPr>
         <w:pStyle w:val="Heading2"/>
       </w:pPr>
-      <w:bookmarkStart w:id="19" w:name="_Toc355966202"/>
-      <w:bookmarkStart w:id="20" w:name="_Toc392495809"/>
-      <w:bookmarkStart w:id="21" w:name="_Toc40883759"/>
+      <w:bookmarkStart w:id="20" w:name="_Toc355966202"/>
+      <w:bookmarkStart w:id="21" w:name="_Toc392495809"/>
+      <w:bookmarkStart w:id="22" w:name="_Toc40886101"/>
       <w:r>
         <w:lastRenderedPageBreak/>
         <w:t>Booking an Exam</w:t>
       </w:r>
-      <w:bookmarkEnd w:id="19"/>
       <w:bookmarkEnd w:id="20"/>
       <w:bookmarkEnd w:id="21"/>
+      <w:bookmarkEnd w:id="22"/>
     </w:p>
     <w:p>
       <w:pPr>
@@ -7825,20 +7485,20 @@
           <w:lang w:eastAsia="en-US"/>
         </w:rPr>
       </w:pPr>
-      <w:bookmarkStart w:id="22" w:name="_Toc355966205"/>
-      <w:bookmarkStart w:id="23" w:name="_Toc392495812"/>
+      <w:bookmarkStart w:id="23" w:name="_Toc355966205"/>
+      <w:bookmarkStart w:id="24" w:name="_Toc392495812"/>
     </w:p>
     <w:p>
       <w:pPr>
         <w:pStyle w:val="Heading2"/>
       </w:pPr>
-      <w:bookmarkStart w:id="24" w:name="_Toc40883760"/>
+      <w:bookmarkStart w:id="25" w:name="_Toc40886102"/>
       <w:r>
         <w:t>The Day of the Exam</w:t>
       </w:r>
-      <w:bookmarkEnd w:id="22"/>
       <w:bookmarkEnd w:id="23"/>
       <w:bookmarkEnd w:id="24"/>
+      <w:bookmarkEnd w:id="25"/>
     </w:p>
     <w:p>
       <w:pPr>
@@ -7875,16 +7535,16 @@
       <w:pPr>
         <w:pStyle w:val="Heading1"/>
       </w:pPr>
-      <w:bookmarkStart w:id="25" w:name="_Toc392495813"/>
-      <w:bookmarkStart w:id="26" w:name="_Toc40883761"/>
+      <w:bookmarkStart w:id="26" w:name="_Toc392495813"/>
+      <w:bookmarkStart w:id="27" w:name="_Toc40886103"/>
       <w:r>
         <w:t>O</w:t>
       </w:r>
       <w:r>
         <w:t>rder of Documents in Student Folder (Active)</w:t>
       </w:r>
-      <w:bookmarkEnd w:id="25"/>
       <w:bookmarkEnd w:id="26"/>
+      <w:bookmarkEnd w:id="27"/>
     </w:p>
     <w:p>
       <w:pPr>
@@ -8674,18 +8334,18 @@
       <w:pPr>
         <w:pStyle w:val="Heading1"/>
       </w:pPr>
-      <w:bookmarkStart w:id="27" w:name="_Toc392495814"/>
+      <w:bookmarkStart w:id="28" w:name="_Toc392495814"/>
     </w:p>
     <w:p>
       <w:pPr>
         <w:pStyle w:val="Heading1"/>
       </w:pPr>
-      <w:bookmarkStart w:id="28" w:name="_Toc40883762"/>
+      <w:bookmarkStart w:id="29" w:name="_Toc40886104"/>
       <w:r>
         <w:t>Order of Documents in Student Folder (Closed)</w:t>
       </w:r>
-      <w:bookmarkEnd w:id="27"/>
       <w:bookmarkEnd w:id="28"/>
+      <w:bookmarkEnd w:id="29"/>
     </w:p>
     <w:p>
       <w:pPr>
@@ -9694,8 +9354,8 @@
       <w:pPr>
         <w:pStyle w:val="Heading1"/>
       </w:pPr>
-      <w:bookmarkStart w:id="29" w:name="_Toc392495815"/>
-      <w:bookmarkStart w:id="30" w:name="_Toc40883763"/>
+      <w:bookmarkStart w:id="30" w:name="_Toc392495815"/>
+      <w:bookmarkStart w:id="31" w:name="_Toc40886105"/>
       <w:r>
         <w:t>T2202A</w:t>
       </w:r>
@@ -9722,8 +9382,8 @@
       <w:r>
         <w:t xml:space="preserve"> Tax Forms</w:t>
       </w:r>
-      <w:bookmarkEnd w:id="29"/>
       <w:bookmarkEnd w:id="30"/>
+      <w:bookmarkEnd w:id="31"/>
       <w:r>
         <w:t xml:space="preserve"> </w:t>
       </w:r>
@@ -10071,13 +9731,13 @@
       <w:pPr>
         <w:pStyle w:val="Heading1"/>
       </w:pPr>
-      <w:bookmarkStart w:id="31" w:name="_Toc392495817"/>
-      <w:bookmarkStart w:id="32" w:name="_Toc40883764"/>
+      <w:bookmarkStart w:id="32" w:name="_Toc392495817"/>
+      <w:bookmarkStart w:id="33" w:name="_Toc40886106"/>
       <w:r>
         <w:t>Transcripts</w:t>
       </w:r>
-      <w:bookmarkEnd w:id="31"/>
       <w:bookmarkEnd w:id="32"/>
+      <w:bookmarkEnd w:id="33"/>
       <w:r>
         <w:t xml:space="preserve">  </w:t>
       </w:r>
@@ -10869,14 +10529,14 @@
       <w:pPr>
         <w:pStyle w:val="Heading1"/>
       </w:pPr>
-      <w:bookmarkStart w:id="33" w:name="_Toc392495818"/>
-      <w:bookmarkStart w:id="34" w:name="_Toc40883765"/>
+      <w:bookmarkStart w:id="34" w:name="_Toc392495818"/>
+      <w:bookmarkStart w:id="35" w:name="_Toc40886107"/>
       <w:r>
         <w:lastRenderedPageBreak/>
         <w:t>Server and Email Configuration</w:t>
       </w:r>
-      <w:bookmarkEnd w:id="33"/>
       <w:bookmarkEnd w:id="34"/>
+      <w:bookmarkEnd w:id="35"/>
     </w:p>
     <w:p>
       <w:pPr>
@@ -11093,13 +10753,13 @@
       <w:pPr>
         <w:pStyle w:val="Heading2"/>
       </w:pPr>
-      <w:bookmarkStart w:id="35" w:name="_Toc392495819"/>
-      <w:bookmarkStart w:id="36" w:name="_Toc40883766"/>
+      <w:bookmarkStart w:id="36" w:name="_Toc392495819"/>
+      <w:bookmarkStart w:id="37" w:name="_Toc40886108"/>
       <w:r>
         <w:t>Email addresses in use</w:t>
       </w:r>
-      <w:bookmarkEnd w:id="35"/>
       <w:bookmarkEnd w:id="36"/>
+      <w:bookmarkEnd w:id="37"/>
     </w:p>
     <w:p>
       <w:pPr>
@@ -11700,13 +11360,11 @@
       <w:pPr>
         <w:pStyle w:val="Heading2"/>
       </w:pPr>
-      <w:bookmarkStart w:id="37" w:name="_Toc392495820"/>
-      <w:bookmarkStart w:id="38" w:name="_Toc40883767"/>
+      <w:bookmarkStart w:id="38" w:name="_Toc392495820"/>
+      <w:bookmarkStart w:id="39" w:name="_Toc40886109"/>
       <w:r>
         <w:t>Server Configuration</w:t>
       </w:r>
-      <w:bookmarkStart w:id="39" w:name="_GoBack"/>
-      <w:bookmarkEnd w:id="37"/>
       <w:bookmarkEnd w:id="38"/>
       <w:bookmarkEnd w:id="39"/>
     </w:p>
@@ -11976,7 +11634,7 @@
         <w:pStyle w:val="Heading1"/>
       </w:pPr>
       <w:bookmarkStart w:id="40" w:name="_Toc392495821"/>
-      <w:bookmarkStart w:id="41" w:name="_Toc40883768"/>
+      <w:bookmarkStart w:id="41" w:name="_Toc40886110"/>
       <w:r>
         <w:lastRenderedPageBreak/>
         <w:t>Wireless Internet Issues</w:t>
@@ -12887,7 +12545,7 @@
         <w:pStyle w:val="Heading1"/>
       </w:pPr>
       <w:bookmarkStart w:id="42" w:name="_Toc392495822"/>
-      <w:bookmarkStart w:id="43" w:name="_Toc40883769"/>
+      <w:bookmarkStart w:id="43" w:name="_Toc40886111"/>
       <w:r>
         <w:lastRenderedPageBreak/>
         <w:t>Printers</w:t>
@@ -12945,7 +12603,7 @@
       </w:pPr>
       <w:bookmarkStart w:id="44" w:name="_Toc392495823"/>
       <w:bookmarkStart w:id="45" w:name="_Toc447275619"/>
-      <w:bookmarkStart w:id="46" w:name="_Toc40883770"/>
+      <w:bookmarkStart w:id="46" w:name="_Toc40886112"/>
       <w:r>
         <w:t>Brother HL5370DW</w:t>
       </w:r>
@@ -13107,7 +12765,7 @@
       </w:pPr>
       <w:bookmarkStart w:id="47" w:name="_Toc392495824"/>
       <w:bookmarkStart w:id="48" w:name="_Toc447275620"/>
-      <w:bookmarkStart w:id="49" w:name="_Toc40883771"/>
+      <w:bookmarkStart w:id="49" w:name="_Toc40886113"/>
       <w:r>
         <w:t>Brother MFC-8460N</w:t>
       </w:r>
@@ -13141,7 +12799,7 @@
         <w:br w:type="page"/>
       </w:r>
       <w:bookmarkStart w:id="50" w:name="_Toc392495825"/>
-      <w:bookmarkStart w:id="51" w:name="_Toc40883772"/>
+      <w:bookmarkStart w:id="51" w:name="_Toc40886114"/>
       <w:r>
         <w:lastRenderedPageBreak/>
         <w:t>Activating Office 2010 Manually</w:t>
@@ -13250,7 +12908,7 @@
         <w:pStyle w:val="Heading2"/>
       </w:pPr>
       <w:bookmarkStart w:id="52" w:name="_Toc392495826"/>
-      <w:bookmarkStart w:id="53" w:name="_Toc40883773"/>
+      <w:bookmarkStart w:id="53" w:name="_Toc40886115"/>
       <w:r>
         <w:t>Activate Office Using OSPP.VBS</w:t>
       </w:r>
@@ -13332,7 +12990,7 @@
         <w:pStyle w:val="Heading1"/>
       </w:pPr>
       <w:bookmarkStart w:id="54" w:name="_Toc392495827"/>
-      <w:bookmarkStart w:id="55" w:name="_Toc40883774"/>
+      <w:bookmarkStart w:id="55" w:name="_Toc40886116"/>
       <w:r>
         <w:t>ACME Login Errors – Security Permissions</w:t>
       </w:r>
@@ -14424,7 +14082,7 @@
                               <w:sz w:val="40"/>
                               <w:szCs w:val="40"/>
                             </w:rPr>
-                            <w:t>11</w:t>
+                            <w:t>2</w:t>
                           </w:r>
                           <w:r>
                             <w:rPr>
@@ -14511,7 +14169,7 @@
                         <w:sz w:val="40"/>
                         <w:szCs w:val="40"/>
                       </w:rPr>
-                      <w:t>11</w:t>
+                      <w:t>2</w:t>
                     </w:r>
                     <w:r>
                       <w:rPr>
@@ -14600,7 +14258,7 @@
         </mc:Choice>
         <mc:Fallback>
           <w:pict>
-            <v:rect w14:anchorId="69B8F04B" id="Rectangle 4" o:spid="_x0000_s1026" style="position:absolute;margin-left:0;margin-top:0;width:468pt;height:2.85pt;z-index:-251656192;visibility:visible;mso-wrap-style:square;mso-width-percent:1000;mso-height-percent:0;mso-wrap-distance-left:9pt;mso-wrap-distance-top:7.2pt;mso-wrap-distance-right:9pt;mso-wrap-distance-bottom:7.2pt;mso-position-horizontal:center;mso-position-horizontal-relative:margin;mso-position-vertical:top;mso-position-vertical-relative:bottom-margin-area;mso-width-percent:1000;mso-height-percent:0;mso-width-relative:margin;mso-height-relative:margin;v-text-anchor:middle" o:gfxdata="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" fillcolor="#4f81bd [3204]" stroked="f" strokeweight="2pt">
+            <v:rect w14:anchorId="5781F280" id="Rectangle 4" o:spid="_x0000_s1026" style="position:absolute;margin-left:0;margin-top:0;width:468pt;height:2.85pt;z-index:-251656192;visibility:visible;mso-wrap-style:square;mso-width-percent:1000;mso-height-percent:0;mso-wrap-distance-left:9pt;mso-wrap-distance-top:7.2pt;mso-wrap-distance-right:9pt;mso-wrap-distance-bottom:7.2pt;mso-position-horizontal:center;mso-position-horizontal-relative:margin;mso-position-vertical:top;mso-position-vertical-relative:bottom-margin-area;mso-width-percent:1000;mso-height-percent:0;mso-width-relative:margin;mso-height-relative:margin;v-text-anchor:middle" o:gfxdata="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" fillcolor="#4f81bd [3204]" stroked="f" strokeweight="2pt">
               <w10:wrap type="square" anchorx="margin" anchory="margin"/>
             </v:rect>
           </w:pict>
@@ -17729,6 +17387,7 @@
     <w:rsid w:val="003C1233"/>
     <w:rsid w:val="0049263A"/>
     <w:rsid w:val="00975F85"/>
+    <w:rsid w:val="00AD43A4"/>
     <w:rsid w:val="00BF6794"/>
   </w:rsids>
   <m:mathPr>
@@ -18494,7 +18153,7 @@
 </file>
 
 <file path=customXml/itemProps1.xml><?xml version="1.0" encoding="utf-8"?>
-<ds:datastoreItem xmlns:ds="http://schemas.openxmlformats.org/officeDocument/2006/customXml" ds:itemID="{90A3B59F-F4F4-47A5-9AD0-CDA9F6793B54}">
+<ds:datastoreItem xmlns:ds="http://schemas.openxmlformats.org/officeDocument/2006/customXml" ds:itemID="{01C9B867-AD85-4F14-80A9-40B359850123}">
   <ds:schemaRefs>
     <ds:schemaRef ds:uri="http://schemas.openxmlformats.org/officeDocument/2006/bibliography"/>
   </ds:schemaRefs>

</xml_diff>